<commit_message>
Updates to project folder
</commit_message>
<xml_diff>
--- a/JOSHUA D THO.docx
+++ b/JOSHUA D THO.docx
@@ -738,25 +738,7 @@
           <w:sz w:val="18"/>
           <w:szCs w:val="18"/>
         </w:rPr>
-        <w:t>Python Programming, Data Management, Web Design &amp; Arch, Adv Markup Authoring, Agentic A.I. &amp; Multi-</w:t>
-      </w:r>
-      <w:r>
-        <w:rPr>
-          <w:rFonts w:ascii="Garamond" w:hAnsi="Garamond" w:cs="Calibri"/>
-          <w:color w:val="000000"/>
-          <w:sz w:val="18"/>
-          <w:szCs w:val="18"/>
-        </w:rPr>
-        <w:t>Agent</w:t>
-      </w:r>
-      <w:r>
-        <w:rPr>
-          <w:rFonts w:ascii="Garamond" w:hAnsi="Garamond" w:cs="Calibri"/>
-          <w:color w:val="000000"/>
-          <w:sz w:val="18"/>
-          <w:szCs w:val="18"/>
-        </w:rPr>
-        <w:t xml:space="preserve"> Sys, </w:t>
+        <w:t xml:space="preserve">Python Programming, Data Management, Web Design &amp; Arch, Adv Markup Authoring, </w:t>
       </w:r>
       <w:r>
         <w:rPr>
@@ -767,6 +749,24 @@
         </w:rPr>
         <w:t xml:space="preserve">Cloud Management, </w:t>
       </w:r>
+    </w:p>
+    <w:p>
+      <w:pPr>
+        <w:pStyle w:val="NormalWeb"/>
+        <w:tabs>
+          <w:tab w:val="right" w:pos="10800"/>
+        </w:tabs>
+        <w:spacing w:before="20" w:beforeAutospacing="0" w:after="0" w:afterAutospacing="0"/>
+        <w:ind w:left="630"/>
+        <w:textAlignment w:val="baseline"/>
+        <w:rPr>
+          <w:rFonts w:ascii="Garamond" w:hAnsi="Garamond"/>
+          <w:b/>
+          <w:bCs/>
+          <w:sz w:val="18"/>
+          <w:szCs w:val="18"/>
+        </w:rPr>
+      </w:pPr>
       <w:r>
         <w:rPr>
           <w:rFonts w:ascii="Garamond" w:hAnsi="Garamond" w:cs="Calibri"/>

</xml_diff>